<commit_message>
Mark EP-14 satisfactory after production logout verification
Update the APA chapters and ICA report now that Playwright passes all 14 cases on the live Vercel build, including logout in 0.9 s.

Co-authored-by: David Ramirez <davidrgj@users.noreply.github.com>
</commit_message>
<xml_diff>
--- a/docs/Capitulos_12_a_16_Pruebas_resultados_APA.docx
+++ b/docs/Capitulos_12_a_16_Pruebas_resultados_APA.docx
@@ -985,7 +985,7 @@
           <w:color w:val="000000"/>
           <w:sz w:val="24"/>
         </w:rPr>
-        <w:t>Figura 6. Cierre de sesión correcto en el build local (poscorrección)</w:t>
+        <w:t>Figura 6. Cierre de sesión correcto en el build productivo de Vercel</w:t>
       </w:r>
     </w:p>
     <w:p>
@@ -1490,7 +1490,7 @@
                 <w:color w:val="000000"/>
                 <w:sz w:val="20"/>
               </w:rPr>
-              <w:t>13/14 en producción; el fallo se corrigió en código</w:t>
+              <w:t>14/14 satisfactorio en producción</w:t>
             </w:r>
           </w:p>
         </w:tc>
@@ -1712,7 +1712,7 @@
                 <w:color w:val="000000"/>
                 <w:sz w:val="20"/>
               </w:rPr>
-              <w:t>Controles de acceso y TLS satisfactorios; cabeceras incompletas</w:t>
+              <w:t>Controles de acceso, TLS y cabeceras anti-clickjacking satisfactorios; CSP no impuesto</w:t>
             </w:r>
           </w:p>
         </w:tc>
@@ -3555,7 +3555,7 @@
           <w:color w:val="000000"/>
           <w:sz w:val="24"/>
         </w:rPr>
-        <w:t>Playwright automatizó 14 casos contra Vercel con un único trabajador, para no invalidar la sesión JWT al cerrar sesión en paralelo. Trece casos fueron satisfactorios. El único fallo de producción es el cierre de sesión (CU-11 / EP-14), tratado en la sección 12.14. La corrección se verificó en http://localhost:4200 en 1,4 s.</w:t>
+        <w:t>Playwright automatizó 14 casos contra Vercel con un único trabajador, para no invalidar la sesión JWT al cerrar sesión en paralelo. En la primera pasada, trece casos fueron satisfactorios y EP-14 falló por una carrera entre signOut y guestGuard. Tras desplegar el arreglo, la suite completa pasó en 13,6 s sobre https://animal-welfare-platform-vepq.vercel.app; el cierre de sesión quedó en 0,9 s.</w:t>
       </w:r>
     </w:p>
     <w:p>
@@ -4702,7 +4702,7 @@
                 <w:color w:val="000000"/>
                 <w:sz w:val="20"/>
               </w:rPr>
-              <w:t>No satisfactorio en Vercel; satisfactorio en local tras el arreglo</w:t>
+              <w:t>Satisfactorio</w:t>
             </w:r>
           </w:p>
         </w:tc>
@@ -4732,7 +4732,7 @@
           <w:color w:val="000000"/>
           <w:sz w:val="20"/>
         </w:rPr>
-        <w:t>Elaboración propia (2026). Esta tabla corrige la versión preliminar que marcaba EP-14 como satisfactorio sin evidencia de cierre de sesión en la nube.</w:t>
+        <w:t>Elaboración propia (2026). EP-14 se reejecutó contra el build productivo después de publicar await signOut y el flag que evita restore() durante el cierre.</w:t>
       </w:r>
     </w:p>
     <w:p>
@@ -5245,7 +5245,7 @@
           <w:color w:val="000000"/>
           <w:sz w:val="22"/>
         </w:rPr>
-        <w:t>Cierre de sesión correcto en el build local, después de esperar signOut de Supabase</w:t>
+        <w:t>Cierre de sesión correcto en el build productivo de Vercel</w:t>
       </w:r>
     </w:p>
     <w:p>
@@ -5272,7 +5272,7 @@
           <w:color w:val="000000"/>
           <w:sz w:val="20"/>
         </w:rPr>
-        <w:t>Elaboración propia (2026). En el build publicado el mismo flujo restauraba la sesión (véase sección 12.14).</w:t>
+        <w:t>Elaboración propia (2026). Tras pulsar Cerrar sesión, la aplicación permanece en /#/login y muestra Entrar.</w:t>
       </w:r>
     </w:p>
     <w:p>
@@ -6936,7 +6936,7 @@
                 <w:color w:val="000000"/>
                 <w:sz w:val="20"/>
               </w:rPr>
-              <w:t>Parcial. Se añadieron las tres últimas en vercel.json; CSP no se forzó para no romper Angular</w:t>
+              <w:t>X-Frame-Options DENY, nosniff y Referrer-Policy están en producción; CSP no se forzó para no romper Angular</w:t>
             </w:r>
           </w:p>
         </w:tc>
@@ -7472,7 +7472,7 @@
           <w:color w:val="000000"/>
           <w:sz w:val="24"/>
         </w:rPr>
-        <w:t>Se ejecutaron 66 casos automatizados. Sesenta y cinco fueron satisfactorios. El caso restante es EP-14 en el build publicado. Tras el arreglo local, el mismo caso pasa. La densidad de defectos abiertos es baja y está documentada. El IBA medio observado en el tablero (81,4) es coherente con el inventario (cinco de seis evaluados) y con el animal fuera de umbral (VACA-087, 45,5, alerta de espacio mínimo ICA).</w:t>
+        <w:t>Se ejecutaron 66 casos automatizados y los 66 fueron satisfactorios en el build publicado. La densidad de defectos abiertos es baja y está documentada. El IBA medio observado en el tablero (81,4) es coherente con el inventario (cinco de seis evaluados) y con el animal fuera de umbral (VACA-087, 45,5, alerta de espacio mínimo ICA).</w:t>
       </w:r>
     </w:p>
     <w:p>
@@ -7655,7 +7655,7 @@
                 <w:color w:val="000000"/>
                 <w:sz w:val="20"/>
               </w:rPr>
-              <w:t>Cerrar sesión en Vercel restaura el JWT: logout() no esperaba supabase.auth.signOut() y guestGuard reenviaba al tablero.</w:t>
+              <w:t>Cerrar sesión en Vercel restauraba el JWT: logout() no esperaba supabase.auth.signOut() y guestGuard reenviaba al tablero.</w:t>
             </w:r>
           </w:p>
         </w:tc>
@@ -7673,7 +7673,7 @@
                 <w:color w:val="000000"/>
                 <w:sz w:val="20"/>
               </w:rPr>
-              <w:t>Corregido en código (await signOut). Pendiente de desplegar Vercel</w:t>
+              <w:t>Corregido y verificado en producción (Playwright, 0,9 s)</w:t>
             </w:r>
           </w:p>
         </w:tc>
@@ -7729,7 +7729,7 @@
                 <w:color w:val="000000"/>
                 <w:sz w:val="20"/>
               </w:rPr>
-              <w:t>El alert nativo de ion-select muestra OK / Cancel en inglés.</w:t>
+              <w:t>El alert nativo de ion-select mostraba OK / Cancel en inglés.</w:t>
             </w:r>
           </w:p>
         </w:tc>
@@ -7747,7 +7747,7 @@
                 <w:color w:val="000000"/>
                 <w:sz w:val="20"/>
               </w:rPr>
-              <w:t>Abierto (copy del componente Ionic)</w:t>
+              <w:t>Corregido: okText Aceptar y cancelText Cancelar</w:t>
             </w:r>
           </w:p>
         </w:tc>
@@ -7821,7 +7821,7 @@
                 <w:color w:val="000000"/>
                 <w:sz w:val="20"/>
               </w:rPr>
-              <w:t>Añadidos en vercel.json; pendiente de desplegar. CSP no se impuso</w:t>
+              <w:t>Desplegado en producción. CSP no se impuso</w:t>
             </w:r>
           </w:p>
         </w:tc>
@@ -8016,7 +8016,7 @@
           <w:color w:val="000000"/>
           <w:sz w:val="24"/>
         </w:rPr>
-        <w:t>El DEF-01 es el único que corta un caso de uso (CU-11). La causa raíz es una condición de carrera: signOut se disparaba sin await, navigateByUrl('/login') activaba guestGuard y restore() aún encontraba la sesión de Supabase. La corrección espera la invalidación del token y después navega. Este hallazgo no debilita el trabajo: ilustra precisamente el valor de las pruebas empíricas sobre el despliegue, frente a una tabla de aceptación marcada a priori como satisfactoria (Sommerville, 2016).</w:t>
+        <w:t>El DEF-01 cortaba el caso de uso CU-11 en el build publicado. La causa raíz era una condición de carrera: signOut se disparaba sin await, navigateByUrl('/login') activaba guestGuard y restore() aún encontraba la sesión de Supabase. La corrección espera la invalidación del token, marca la sesión como limpiada para que restore() no la rehidrate y después navega. El 27 de octubre de 2026 se publicó en Vercel y Playwright confirmó el retorno a /#/login. Este hallazgo no debilita el trabajo: ilustra el valor de las pruebas empíricas sobre el despliegue, frente a una tabla de aceptación marcada a priori como satisfactoria (Sommerville, 2016).</w:t>
       </w:r>
     </w:p>
     <w:p>
@@ -8189,7 +8189,7 @@
           <w:color w:val="000000"/>
           <w:sz w:val="24"/>
         </w:rPr>
-        <w:t>En el plano metodológico, la campaña confirma que una tabla de 14 escenarios marcada como satisfactoria sin automatizar el cierre de sesión en la nube es insuficiente (Pressman y Maxim, 2015). El DEF-01 solo apareció cuando Playwright esperó la URL /login después de Cerrar sesión. La lección para la Fábrica de Software es incorporar E2E del camino infeliz (logout, guarda, RLS anónimo) en la definición de terminado de cada sprint Scrum. Al mismo tiempo, la pirámide evitó que un error de THI (81,3 versus 82,92) llegara disfrazado de prueba verde.</w:t>
+        <w:t>En el plano metodológico, la campaña confirma que una tabla de 14 escenarios marcada como satisfactoria sin automatizar el cierre de sesión en la nube es insuficiente (Pressman y Maxim, 2015). El DEF-01 solo apareció cuando Playwright esperó la URL /login después de Cerrar sesión; una vez desplegada la corrección, EP-14 pasó en producción. La lección para la Fábrica de Software es incorporar E2E del camino infeliz (logout, guarda, RLS anónimo) en la definición de terminado de cada sprint Scrum. Al mismo tiempo, la pirámide evitó que un error de THI (81,3 versus 82,92) llegara disfrazado de prueba verde.</w:t>
       </w:r>
     </w:p>
     <w:p>
@@ -8473,7 +8473,7 @@
           <w:color w:val="000000"/>
           <w:sz w:val="24"/>
         </w:rPr>
-        <w:t>Las pruebas —unitarias, de aceptación, E2E, de API, de carga y de seguridad— aportan evidencia reproducible de que el prototipo publicado es usable por un administrador, que el anónimo no lee datos y que el único caso de uso roto en producción (cierre de sesión) tiene causa raíz identificada y corrección verificada en local. Esa transparencia fortalece, no debilita, la validez del trabajo de grado.</w:t>
+        <w:t>Las pruebas —unitarias, de aceptación, E2E, de API, de carga y de seguridad— aportan evidencia reproducible de que el prototipo publicado es usable por un administrador, que el anónimo no lee datos y que el cierre de sesión (CU-11 / EP-14) permanece en login tras invalidar el JWT. Esa transparencia fortalece, no debilita, la validez del trabajo de grado.</w:t>
       </w:r>
     </w:p>
     <w:p>
@@ -8523,7 +8523,7 @@
           <w:color w:val="000000"/>
           <w:sz w:val="24"/>
         </w:rPr>
-        <w:t>1. Publicar en Vercel el arreglo de logout y las cabeceras de vercel.json, y repetir EP-14 sobre el build productivo hasta marcarlo satisfactorio con evidencia.</w:t>
+        <w:t>1. Ajustar el enunciado del segundo objetivo específico en la versión final del documento marco, para que hable de analítica de reglas e índices ICA y no de “técnicas de IA” si no se entrena un modelo.</w:t>
       </w:r>
     </w:p>
     <w:p>
@@ -8540,7 +8540,7 @@
           <w:color w:val="000000"/>
           <w:sz w:val="24"/>
         </w:rPr>
-        <w:t>2. Ajustar el enunciado del segundo objetivo específico en la versión final del documento marco, para que hable de analítica de reglas e índices ICA y no de “técnicas de IA” si no se entrena un modelo.</w:t>
+        <w:t>2. Retirar del alcance vigente el RNF de persistencia offline, o implementarlo con una prueba de sincronización, pero no dejarlo como requisito no verificado.</w:t>
       </w:r>
     </w:p>
     <w:p>
@@ -8557,7 +8557,7 @@
           <w:color w:val="000000"/>
           <w:sz w:val="24"/>
         </w:rPr>
-        <w:t>3. Retirar del alcance vigente el RNF de persistencia offline, o implementarlo con una prueba de sincronización, pero no dejarlo como requisito no verificado.</w:t>
+        <w:t>3. Valorar un Content-Security-Policy explícito cuando pueda ensayarse sin romper Ionic, y restringir el bucket de fotos si el prototipo escala a datos reales de predios.</w:t>
       </w:r>
     </w:p>
     <w:p>
@@ -8574,7 +8574,7 @@
           <w:color w:val="000000"/>
           <w:sz w:val="24"/>
         </w:rPr>
-        <w:t>4. Valorar un Content-Security-Policy explícito cuando pueda ensayarse sin romper Ionic, y restringir el bucket de fotos si el prototipo escala a datos reales de predios.</w:t>
+        <w:t>4. Retirar el hint de credenciales demo en un entorno que deje de ser académico.</w:t>
       </w:r>
     </w:p>
     <w:p>
@@ -8591,7 +8591,7 @@
           <w:color w:val="000000"/>
           <w:sz w:val="24"/>
         </w:rPr>
-        <w:t>5. Traducir o sustituir el alert OK/Cancel de ion-select, y retirar el hint de credenciales demo en un entorno que deje de ser académico.</w:t>
+        <w:t>5. Como trabajo futuro —no como deuda de este prototipo—, integrar sensores IoT o wearables (Marketintelo, 2025) y, si hay corpus etiquetado, un clasificador de estrés térmico (Lascano-Rivera et al., 2025), manteniendo el IBA actual como línea base interpretable.</w:t>
       </w:r>
     </w:p>
     <w:p>
@@ -8608,24 +8608,7 @@
           <w:color w:val="000000"/>
           <w:sz w:val="24"/>
         </w:rPr>
-        <w:t>6. Como trabajo futuro —no como deuda de este prototipo—, integrar sensores IoT o wearables (Marketintelo, 2025) y, si hay corpus etiquetado, un clasificador de estrés térmico (Lascano-Rivera et al., 2025), manteniendo el IBA actual como línea base interpretable.</w:t>
-      </w:r>
-    </w:p>
-    <w:p>
-      <w:pPr>
-        <w:spacing w:after="160" w:before="0" w:line="360" w:lineRule="auto"/>
-        <w:ind w:firstLine="0"/>
-        <w:jc w:val="both"/>
-      </w:pPr>
-      <w:r>
-        <w:rPr>
-          <w:rFonts w:ascii="Times New Roman" w:hAnsi="Times New Roman" w:eastAsia="Times New Roman"/>
-          <w:b w:val="0"/>
-          <w:i w:val="0"/>
-          <w:color w:val="000000"/>
-          <w:sz w:val="24"/>
-        </w:rPr>
-        <w:t>7. Registrar E2E_EMAIL y E2E_PASSWORD como secretos de GitHub Actions para que el E2E deje de ser solo local/manual.</w:t>
+        <w:t>6. Registrar E2E_EMAIL y E2E_PASSWORD como secretos de GitHub Actions para que el E2E deje de ser solo local/manual.</w:t>
       </w:r>
     </w:p>
     <w:p>

</xml_diff>

<commit_message>
Deliver complete APA test chapters with per-scenario screenshots
Re-run the full suite green on Vercel, expand E2E evidence for animal detail, welfare, simulation and mobile, and regenerate the ICA report plus APA chapters 12–16 with all EP cases satisfactory.

Co-authored-by: David Ramirez <davidrgj@users.noreply.github.com>
</commit_message>
<xml_diff>
--- a/docs/Capitulos_12_a_16_Pruebas_resultados_APA.docx
+++ b/docs/Capitulos_12_a_16_Pruebas_resultados_APA.docx
@@ -1002,7 +1002,7 @@
           <w:color w:val="000000"/>
           <w:sz w:val="24"/>
         </w:rPr>
-        <w:t>Figura 7. Módulo de simulación</w:t>
+        <w:t>Figura 7. Inventario de animales (6 ejemplares)</w:t>
       </w:r>
     </w:p>
     <w:p>
@@ -1019,7 +1019,75 @@
           <w:color w:val="000000"/>
           <w:sz w:val="24"/>
         </w:rPr>
-        <w:t>Figura 8. Reporte de predio</w:t>
+        <w:t>Figura 8. Detalle e IBA de VACA-087</w:t>
+      </w:r>
+    </w:p>
+    <w:p>
+      <w:pPr>
+        <w:spacing w:after="60" w:before="0" w:line="360" w:lineRule="auto"/>
+        <w:ind w:firstLine="0"/>
+        <w:jc w:val="left"/>
+      </w:pPr>
+      <w:r>
+        <w:rPr>
+          <w:rFonts w:ascii="Times New Roman" w:hAnsi="Times New Roman" w:eastAsia="Times New Roman"/>
+          <w:b w:val="0"/>
+          <w:i w:val="0"/>
+          <w:color w:val="000000"/>
+          <w:sz w:val="24"/>
+        </w:rPr>
+        <w:t>Figura 9. Formulario de evaluación ICA</w:t>
+      </w:r>
+    </w:p>
+    <w:p>
+      <w:pPr>
+        <w:spacing w:after="60" w:before="0" w:line="360" w:lineRule="auto"/>
+        <w:ind w:firstLine="0"/>
+        <w:jc w:val="left"/>
+      </w:pPr>
+      <w:r>
+        <w:rPr>
+          <w:rFonts w:ascii="Times New Roman" w:hAnsi="Times New Roman" w:eastAsia="Times New Roman"/>
+          <w:b w:val="0"/>
+          <w:i w:val="0"/>
+          <w:color w:val="000000"/>
+          <w:sz w:val="24"/>
+        </w:rPr>
+        <w:t>Figura 10. Módulo de simulación y detalle SED</w:t>
+      </w:r>
+    </w:p>
+    <w:p>
+      <w:pPr>
+        <w:spacing w:after="60" w:before="0" w:line="360" w:lineRule="auto"/>
+        <w:ind w:firstLine="0"/>
+        <w:jc w:val="left"/>
+      </w:pPr>
+      <w:r>
+        <w:rPr>
+          <w:rFonts w:ascii="Times New Roman" w:hAnsi="Times New Roman" w:eastAsia="Times New Roman"/>
+          <w:b w:val="0"/>
+          <w:i w:val="0"/>
+          <w:color w:val="000000"/>
+          <w:sz w:val="24"/>
+        </w:rPr>
+        <w:t>Figura 11. Reporte de predio</w:t>
+      </w:r>
+    </w:p>
+    <w:p>
+      <w:pPr>
+        <w:spacing w:after="60" w:before="0" w:line="360" w:lineRule="auto"/>
+        <w:ind w:firstLine="0"/>
+        <w:jc w:val="left"/>
+      </w:pPr>
+      <w:r>
+        <w:rPr>
+          <w:rFonts w:ascii="Times New Roman" w:hAnsi="Times New Roman" w:eastAsia="Times New Roman"/>
+          <w:b w:val="0"/>
+          <w:i w:val="0"/>
+          <w:color w:val="000000"/>
+          <w:sz w:val="24"/>
+        </w:rPr>
+        <w:t>Figura 12. Tablero en viewport móvil 390×844</w:t>
       </w:r>
     </w:p>
     <w:p>
@@ -1472,7 +1540,7 @@
                 <w:color w:val="000000"/>
                 <w:sz w:val="20"/>
               </w:rPr>
-              <w:t>Playwright (Chromium) contra Vercel y local</w:t>
+              <w:t>Playwright (Chromium) contra Vercel</w:t>
             </w:r>
           </w:p>
         </w:tc>
@@ -1490,7 +1558,7 @@
                 <w:color w:val="000000"/>
                 <w:sz w:val="20"/>
               </w:rPr>
-              <w:t>14/14 satisfactorio en producción</w:t>
+              <w:t>17/17 satisfactorio en producción (14 EP + móvil + detalle)</w:t>
             </w:r>
           </w:p>
         </w:tc>
@@ -1638,7 +1706,7 @@
                 <w:color w:val="000000"/>
                 <w:sz w:val="20"/>
               </w:rPr>
-              <w:t>2/2; p95 = 53,4 ms</w:t>
+              <w:t>2/2; p95 ≈ 53 ms</w:t>
             </w:r>
           </w:p>
         </w:tc>
@@ -1786,7 +1854,7 @@
                 <w:color w:val="000000"/>
                 <w:sz w:val="20"/>
               </w:rPr>
-              <w:t>Índice 95,8 (rating A)</w:t>
+              <w:t>Índice 95,6 (rating A)</w:t>
             </w:r>
           </w:p>
         </w:tc>
@@ -3555,7 +3623,7 @@
           <w:color w:val="000000"/>
           <w:sz w:val="24"/>
         </w:rPr>
-        <w:t>Playwright automatizó 14 casos contra Vercel con un único trabajador, para no invalidar la sesión JWT al cerrar sesión en paralelo. En la primera pasada, trece casos fueron satisfactorios y EP-14 falló por una carrera entre signOut y guestGuard. Tras desplegar el arreglo, la suite completa pasó en 13,6 s sobre https://animal-welfare-platform-vepq.vercel.app; el cierre de sesión quedó en 0,9 s.</w:t>
+        <w:t>Playwright automatizó 17 casos contra Vercel con un único trabajador, para no invalidar la sesión JWT al cerrar sesión en paralelo. Los 14 escenarios EP del trabajo de grado, más detalle animal, evaluación ICA, detalle de simulación y viewport móvil, fueron satisfactorios en ≈ 19 s sobre https://animal-welfare-platform-vepq.vercel.app. El cierre de sesión (EP-14) permaneció en /#/login.</w:t>
       </w:r>
     </w:p>
     <w:p>
@@ -4258,7 +4326,7 @@
                 <w:color w:val="000000"/>
                 <w:sz w:val="20"/>
               </w:rPr>
-              <w:t>Satisfactorio</w:t>
+              <w:t>Satisfactorio (VACA-087, IBA 45,5)</w:t>
             </w:r>
           </w:p>
         </w:tc>
@@ -4406,7 +4474,7 @@
                 <w:color w:val="000000"/>
                 <w:sz w:val="20"/>
               </w:rPr>
-              <w:t>Satisfactorio</w:t>
+              <w:t>Satisfactorio (125,3 kg; IBA 68,2)</w:t>
             </w:r>
           </w:p>
         </w:tc>
@@ -4732,7 +4800,7 @@
           <w:color w:val="000000"/>
           <w:sz w:val="20"/>
         </w:rPr>
-        <w:t>Elaboración propia (2026). EP-14 se reejecutó contra el build productivo después de publicar await signOut y el flag que evita restore() durante el cierre.</w:t>
+        <w:t>Elaboración propia (2026). Los catorce escenarios EP son satisfactorios en el build productivo de Vercel; cada uno cuenta con captura de pantalla en el informe de evidencias.</w:t>
       </w:r>
     </w:p>
     <w:p>
@@ -5288,7 +5356,7 @@
               <a:graphicData uri="http://schemas.openxmlformats.org/drawingml/2006/picture">
                 <pic:pic>
                   <pic:nvPicPr>
-                    <pic:cNvPr id="0" name="10-simulation.png"/>
+                    <pic:cNvPr id="0" name="09-animals.png"/>
                     <pic:cNvPicPr/>
                   </pic:nvPicPr>
                   <pic:blipFill>
@@ -5326,6 +5394,276 @@
           <w:sz w:val="22"/>
         </w:rPr>
         <w:t xml:space="preserve">Figura 7. </w:t>
+      </w:r>
+      <w:r>
+        <w:rPr>
+          <w:rFonts w:ascii="Times New Roman" w:hAnsi="Times New Roman" w:eastAsia="Times New Roman"/>
+          <w:b w:val="0"/>
+          <w:i w:val="0"/>
+          <w:color w:val="000000"/>
+          <w:sz w:val="22"/>
+        </w:rPr>
+        <w:t>Inventario animal con seis ejemplares e IBA</w:t>
+      </w:r>
+    </w:p>
+    <w:p>
+      <w:pPr>
+        <w:spacing w:after="240" w:before="0" w:line="276" w:lineRule="auto"/>
+        <w:ind w:firstLine="0"/>
+        <w:jc w:val="left"/>
+      </w:pPr>
+      <w:r>
+        <w:rPr>
+          <w:rFonts w:ascii="Times New Roman" w:hAnsi="Times New Roman" w:eastAsia="Times New Roman"/>
+          <w:b w:val="0"/>
+          <w:i/>
+          <w:color w:val="000000"/>
+          <w:sz w:val="20"/>
+        </w:rPr>
+        <w:t xml:space="preserve">Nota. </w:t>
+      </w:r>
+      <w:r>
+        <w:rPr>
+          <w:rFonts w:ascii="Times New Roman" w:hAnsi="Times New Roman" w:eastAsia="Times New Roman"/>
+          <w:b w:val="0"/>
+          <w:i w:val="0"/>
+          <w:color w:val="000000"/>
+          <w:sz w:val="20"/>
+        </w:rPr>
+        <w:t>Elaboración propia (2026). 1 en riesgo, 1 sin IBA y 4 en umbral; filtros Todos / Riesgo / Sin IBA / Cumple.</w:t>
+      </w:r>
+    </w:p>
+    <w:p>
+      <w:r>
+        <w:drawing>
+          <wp:inline xmlns:a="http://schemas.openxmlformats.org/drawingml/2006/main" xmlns:pic="http://schemas.openxmlformats.org/drawingml/2006/picture">
+            <wp:extent cx="5220000" cy="3262500"/>
+            <wp:docPr id="8" name="Picture 8"/>
+            <wp:cNvGraphicFramePr>
+              <a:graphicFrameLocks noChangeAspect="1"/>
+            </wp:cNvGraphicFramePr>
+            <a:graphic>
+              <a:graphicData uri="http://schemas.openxmlformats.org/drawingml/2006/picture">
+                <pic:pic>
+                  <pic:nvPicPr>
+                    <pic:cNvPr id="0" name="21-animal-detail.png"/>
+                    <pic:cNvPicPr/>
+                  </pic:nvPicPr>
+                  <pic:blipFill>
+                    <a:blip r:embed="rId15"/>
+                    <a:stretch>
+                      <a:fillRect/>
+                    </a:stretch>
+                  </pic:blipFill>
+                  <pic:spPr>
+                    <a:xfrm>
+                      <a:off x="0" y="0"/>
+                      <a:ext cx="5220000" cy="3262500"/>
+                    </a:xfrm>
+                    <a:prstGeom prst="rect"/>
+                  </pic:spPr>
+                </pic:pic>
+              </a:graphicData>
+            </a:graphic>
+          </wp:inline>
+        </w:drawing>
+      </w:r>
+    </w:p>
+    <w:p>
+      <w:pPr>
+        <w:spacing w:after="120" w:before="0" w:line="276" w:lineRule="auto"/>
+        <w:ind w:firstLine="0"/>
+        <w:jc w:val="left"/>
+      </w:pPr>
+      <w:r>
+        <w:rPr>
+          <w:rFonts w:ascii="Times New Roman" w:hAnsi="Times New Roman" w:eastAsia="Times New Roman"/>
+          <w:b/>
+          <w:i w:val="0"/>
+          <w:color w:val="000000"/>
+          <w:sz w:val="22"/>
+        </w:rPr>
+        <w:t xml:space="preserve">Figura 8. </w:t>
+      </w:r>
+      <w:r>
+        <w:rPr>
+          <w:rFonts w:ascii="Times New Roman" w:hAnsi="Times New Roman" w:eastAsia="Times New Roman"/>
+          <w:b w:val="0"/>
+          <w:i w:val="0"/>
+          <w:color w:val="000000"/>
+          <w:sz w:val="22"/>
+        </w:rPr>
+        <w:t>Detalle e IBA de VACA-087</w:t>
+      </w:r>
+    </w:p>
+    <w:p>
+      <w:pPr>
+        <w:spacing w:after="240" w:before="0" w:line="276" w:lineRule="auto"/>
+        <w:ind w:firstLine="0"/>
+        <w:jc w:val="left"/>
+      </w:pPr>
+      <w:r>
+        <w:rPr>
+          <w:rFonts w:ascii="Times New Roman" w:hAnsi="Times New Roman" w:eastAsia="Times New Roman"/>
+          <w:b w:val="0"/>
+          <w:i/>
+          <w:color w:val="000000"/>
+          <w:sz w:val="20"/>
+        </w:rPr>
+        <w:t xml:space="preserve">Nota. </w:t>
+      </w:r>
+      <w:r>
+        <w:rPr>
+          <w:rFonts w:ascii="Times New Roman" w:hAnsi="Times New Roman" w:eastAsia="Times New Roman"/>
+          <w:b w:val="0"/>
+          <w:i w:val="0"/>
+          <w:color w:val="000000"/>
+          <w:sz w:val="20"/>
+        </w:rPr>
+        <w:t>Elaboración propia (2026). Anillo 45,5, dominios de las cinco libertades, THI 85,7 e historial con formato d MMM, y hh:mm a.</w:t>
+      </w:r>
+    </w:p>
+    <w:p>
+      <w:r>
+        <w:drawing>
+          <wp:inline xmlns:a="http://schemas.openxmlformats.org/drawingml/2006/main" xmlns:pic="http://schemas.openxmlformats.org/drawingml/2006/picture">
+            <wp:extent cx="5220000" cy="3262500"/>
+            <wp:docPr id="9" name="Picture 9"/>
+            <wp:cNvGraphicFramePr>
+              <a:graphicFrameLocks noChangeAspect="1"/>
+            </wp:cNvGraphicFramePr>
+            <a:graphic>
+              <a:graphicData uri="http://schemas.openxmlformats.org/drawingml/2006/picture">
+                <pic:pic>
+                  <pic:nvPicPr>
+                    <pic:cNvPr id="0" name="22-welfare-form.png"/>
+                    <pic:cNvPicPr/>
+                  </pic:nvPicPr>
+                  <pic:blipFill>
+                    <a:blip r:embed="rId16"/>
+                    <a:stretch>
+                      <a:fillRect/>
+                    </a:stretch>
+                  </pic:blipFill>
+                  <pic:spPr>
+                    <a:xfrm>
+                      <a:off x="0" y="0"/>
+                      <a:ext cx="5220000" cy="3262500"/>
+                    </a:xfrm>
+                    <a:prstGeom prst="rect"/>
+                  </pic:spPr>
+                </pic:pic>
+              </a:graphicData>
+            </a:graphic>
+          </wp:inline>
+        </w:drawing>
+      </w:r>
+    </w:p>
+    <w:p>
+      <w:pPr>
+        <w:spacing w:after="120" w:before="0" w:line="276" w:lineRule="auto"/>
+        <w:ind w:firstLine="0"/>
+        <w:jc w:val="left"/>
+      </w:pPr>
+      <w:r>
+        <w:rPr>
+          <w:rFonts w:ascii="Times New Roman" w:hAnsi="Times New Roman" w:eastAsia="Times New Roman"/>
+          <w:b/>
+          <w:i w:val="0"/>
+          <w:color w:val="000000"/>
+          <w:sz w:val="22"/>
+        </w:rPr>
+        <w:t xml:space="preserve">Figura 9. </w:t>
+      </w:r>
+      <w:r>
+        <w:rPr>
+          <w:rFonts w:ascii="Times New Roman" w:hAnsi="Times New Roman" w:eastAsia="Times New Roman"/>
+          <w:b w:val="0"/>
+          <w:i w:val="0"/>
+          <w:color w:val="000000"/>
+          <w:sz w:val="22"/>
+        </w:rPr>
+        <w:t>Formulario de evaluación ICA (cinco libertades)</w:t>
+      </w:r>
+    </w:p>
+    <w:p>
+      <w:pPr>
+        <w:spacing w:after="240" w:before="0" w:line="276" w:lineRule="auto"/>
+        <w:ind w:firstLine="0"/>
+        <w:jc w:val="left"/>
+      </w:pPr>
+      <w:r>
+        <w:rPr>
+          <w:rFonts w:ascii="Times New Roman" w:hAnsi="Times New Roman" w:eastAsia="Times New Roman"/>
+          <w:b w:val="0"/>
+          <w:i/>
+          <w:color w:val="000000"/>
+          <w:sz w:val="20"/>
+        </w:rPr>
+        <w:t xml:space="preserve">Nota. </w:t>
+      </w:r>
+      <w:r>
+        <w:rPr>
+          <w:rFonts w:ascii="Times New Roman" w:hAnsi="Times New Roman" w:eastAsia="Times New Roman"/>
+          <w:b w:val="0"/>
+          <w:i w:val="0"/>
+          <w:color w:val="000000"/>
+          <w:sz w:val="20"/>
+        </w:rPr>
+        <w:t>Elaboración propia (2026). Campos de nutrición, entorno, salud y conducta; el IBA se calcula al guardar.</w:t>
+      </w:r>
+    </w:p>
+    <w:p>
+      <w:r>
+        <w:drawing>
+          <wp:inline xmlns:a="http://schemas.openxmlformats.org/drawingml/2006/main" xmlns:pic="http://schemas.openxmlformats.org/drawingml/2006/picture">
+            <wp:extent cx="5220000" cy="3262500"/>
+            <wp:docPr id="10" name="Picture 10"/>
+            <wp:cNvGraphicFramePr>
+              <a:graphicFrameLocks noChangeAspect="1"/>
+            </wp:cNvGraphicFramePr>
+            <a:graphic>
+              <a:graphicData uri="http://schemas.openxmlformats.org/drawingml/2006/picture">
+                <pic:pic>
+                  <pic:nvPicPr>
+                    <pic:cNvPr id="0" name="10-simulation.png"/>
+                    <pic:cNvPicPr/>
+                  </pic:nvPicPr>
+                  <pic:blipFill>
+                    <a:blip r:embed="rId17"/>
+                    <a:stretch>
+                      <a:fillRect/>
+                    </a:stretch>
+                  </pic:blipFill>
+                  <pic:spPr>
+                    <a:xfrm>
+                      <a:off x="0" y="0"/>
+                      <a:ext cx="5220000" cy="3262500"/>
+                    </a:xfrm>
+                    <a:prstGeom prst="rect"/>
+                  </pic:spPr>
+                </pic:pic>
+              </a:graphicData>
+            </a:graphic>
+          </wp:inline>
+        </w:drawing>
+      </w:r>
+    </w:p>
+    <w:p>
+      <w:pPr>
+        <w:spacing w:after="120" w:before="0" w:line="276" w:lineRule="auto"/>
+        <w:ind w:firstLine="0"/>
+        <w:jc w:val="left"/>
+      </w:pPr>
+      <w:r>
+        <w:rPr>
+          <w:rFonts w:ascii="Times New Roman" w:hAnsi="Times New Roman" w:eastAsia="Times New Roman"/>
+          <w:b/>
+          <w:i w:val="0"/>
+          <w:color w:val="000000"/>
+          <w:sz w:val="22"/>
+        </w:rPr>
+        <w:t xml:space="preserve">Figura 10. </w:t>
       </w:r>
       <w:r>
         <w:rPr>
@@ -5370,7 +5708,7 @@
         <w:drawing>
           <wp:inline xmlns:a="http://schemas.openxmlformats.org/drawingml/2006/main" xmlns:pic="http://schemas.openxmlformats.org/drawingml/2006/picture">
             <wp:extent cx="5220000" cy="3262500"/>
-            <wp:docPr id="8" name="Picture 8"/>
+            <wp:docPr id="11" name="Picture 11"/>
             <wp:cNvGraphicFramePr>
               <a:graphicFrameLocks noChangeAspect="1"/>
             </wp:cNvGraphicFramePr>
@@ -5378,11 +5716,11 @@
               <a:graphicData uri="http://schemas.openxmlformats.org/drawingml/2006/picture">
                 <pic:pic>
                   <pic:nvPicPr>
-                    <pic:cNvPr id="0" name="14-reports.png"/>
+                    <pic:cNvPr id="0" name="23-simulation-detail.png"/>
                     <pic:cNvPicPr/>
                   </pic:nvPicPr>
                   <pic:blipFill>
-                    <a:blip r:embed="rId15"/>
+                    <a:blip r:embed="rId18"/>
                     <a:stretch>
                       <a:fillRect/>
                     </a:stretch>
@@ -5415,7 +5753,97 @@
           <w:color w:val="000000"/>
           <w:sz w:val="22"/>
         </w:rPr>
-        <w:t xml:space="preserve">Figura 8. </w:t>
+        <w:t xml:space="preserve">Figura 11. </w:t>
+      </w:r>
+      <w:r>
+        <w:rPr>
+          <w:rFonts w:ascii="Times New Roman" w:hAnsi="Times New Roman" w:eastAsia="Times New Roman"/>
+          <w:b w:val="0"/>
+          <w:i w:val="0"/>
+          <w:color w:val="000000"/>
+          <w:sz w:val="22"/>
+        </w:rPr>
+        <w:t>Detalle de simulación con trayectoria de peso e IBA</w:t>
+      </w:r>
+    </w:p>
+    <w:p>
+      <w:pPr>
+        <w:spacing w:after="240" w:before="0" w:line="276" w:lineRule="auto"/>
+        <w:ind w:firstLine="0"/>
+        <w:jc w:val="left"/>
+      </w:pPr>
+      <w:r>
+        <w:rPr>
+          <w:rFonts w:ascii="Times New Roman" w:hAnsi="Times New Roman" w:eastAsia="Times New Roman"/>
+          <w:b w:val="0"/>
+          <w:i/>
+          <w:color w:val="000000"/>
+          <w:sz w:val="20"/>
+        </w:rPr>
+        <w:t xml:space="preserve">Nota. </w:t>
+      </w:r>
+      <w:r>
+        <w:rPr>
+          <w:rFonts w:ascii="Times New Roman" w:hAnsi="Times New Roman" w:eastAsia="Times New Roman"/>
+          <w:b w:val="0"/>
+          <w:i w:val="0"/>
+          <w:color w:val="000000"/>
+          <w:sz w:val="20"/>
+        </w:rPr>
+        <w:t>Elaboración propia (2026). Peso final 125,3 kg e IBA proyectado 68,2 bajo restricción de alimento.</w:t>
+      </w:r>
+    </w:p>
+    <w:p>
+      <w:r>
+        <w:drawing>
+          <wp:inline xmlns:a="http://schemas.openxmlformats.org/drawingml/2006/main" xmlns:pic="http://schemas.openxmlformats.org/drawingml/2006/picture">
+            <wp:extent cx="5220000" cy="3262500"/>
+            <wp:docPr id="12" name="Picture 12"/>
+            <wp:cNvGraphicFramePr>
+              <a:graphicFrameLocks noChangeAspect="1"/>
+            </wp:cNvGraphicFramePr>
+            <a:graphic>
+              <a:graphicData uri="http://schemas.openxmlformats.org/drawingml/2006/picture">
+                <pic:pic>
+                  <pic:nvPicPr>
+                    <pic:cNvPr id="0" name="14-reports.png"/>
+                    <pic:cNvPicPr/>
+                  </pic:nvPicPr>
+                  <pic:blipFill>
+                    <a:blip r:embed="rId19"/>
+                    <a:stretch>
+                      <a:fillRect/>
+                    </a:stretch>
+                  </pic:blipFill>
+                  <pic:spPr>
+                    <a:xfrm>
+                      <a:off x="0" y="0"/>
+                      <a:ext cx="5220000" cy="3262500"/>
+                    </a:xfrm>
+                    <a:prstGeom prst="rect"/>
+                  </pic:spPr>
+                </pic:pic>
+              </a:graphicData>
+            </a:graphic>
+          </wp:inline>
+        </w:drawing>
+      </w:r>
+    </w:p>
+    <w:p>
+      <w:pPr>
+        <w:spacing w:after="120" w:before="0" w:line="276" w:lineRule="auto"/>
+        <w:ind w:firstLine="0"/>
+        <w:jc w:val="left"/>
+      </w:pPr>
+      <w:r>
+        <w:rPr>
+          <w:rFonts w:ascii="Times New Roman" w:hAnsi="Times New Roman" w:eastAsia="Times New Roman"/>
+          <w:b/>
+          <w:i w:val="0"/>
+          <w:color w:val="000000"/>
+          <w:sz w:val="22"/>
+        </w:rPr>
+        <w:t xml:space="preserve">Figura 12. </w:t>
       </w:r>
       <w:r>
         <w:rPr>
@@ -5453,6 +5881,96 @@
           <w:sz w:val="20"/>
         </w:rPr>
         <w:t>Elaboración propia (2026).</w:t>
+      </w:r>
+    </w:p>
+    <w:p>
+      <w:r>
+        <w:drawing>
+          <wp:inline xmlns:a="http://schemas.openxmlformats.org/drawingml/2006/main" xmlns:pic="http://schemas.openxmlformats.org/drawingml/2006/picture">
+            <wp:extent cx="5220000" cy="11296615"/>
+            <wp:docPr id="13" name="Picture 13"/>
+            <wp:cNvGraphicFramePr>
+              <a:graphicFrameLocks noChangeAspect="1"/>
+            </wp:cNvGraphicFramePr>
+            <a:graphic>
+              <a:graphicData uri="http://schemas.openxmlformats.org/drawingml/2006/picture">
+                <pic:pic>
+                  <pic:nvPicPr>
+                    <pic:cNvPr id="0" name="20-mobile-dashboard-390x844.png"/>
+                    <pic:cNvPicPr/>
+                  </pic:nvPicPr>
+                  <pic:blipFill>
+                    <a:blip r:embed="rId20"/>
+                    <a:stretch>
+                      <a:fillRect/>
+                    </a:stretch>
+                  </pic:blipFill>
+                  <pic:spPr>
+                    <a:xfrm>
+                      <a:off x="0" y="0"/>
+                      <a:ext cx="5220000" cy="11296615"/>
+                    </a:xfrm>
+                    <a:prstGeom prst="rect"/>
+                  </pic:spPr>
+                </pic:pic>
+              </a:graphicData>
+            </a:graphic>
+          </wp:inline>
+        </w:drawing>
+      </w:r>
+    </w:p>
+    <w:p>
+      <w:pPr>
+        <w:spacing w:after="120" w:before="0" w:line="276" w:lineRule="auto"/>
+        <w:ind w:firstLine="0"/>
+        <w:jc w:val="left"/>
+      </w:pPr>
+      <w:r>
+        <w:rPr>
+          <w:rFonts w:ascii="Times New Roman" w:hAnsi="Times New Roman" w:eastAsia="Times New Roman"/>
+          <w:b/>
+          <w:i w:val="0"/>
+          <w:color w:val="000000"/>
+          <w:sz w:val="22"/>
+        </w:rPr>
+        <w:t xml:space="preserve">Figura 13. </w:t>
+      </w:r>
+      <w:r>
+        <w:rPr>
+          <w:rFonts w:ascii="Times New Roman" w:hAnsi="Times New Roman" w:eastAsia="Times New Roman"/>
+          <w:b w:val="0"/>
+          <w:i w:val="0"/>
+          <w:color w:val="000000"/>
+          <w:sz w:val="22"/>
+        </w:rPr>
+        <w:t>Tablero Estado ICA en viewport móvil 390×844</w:t>
+      </w:r>
+    </w:p>
+    <w:p>
+      <w:pPr>
+        <w:spacing w:after="240" w:before="0" w:line="276" w:lineRule="auto"/>
+        <w:ind w:firstLine="0"/>
+        <w:jc w:val="left"/>
+      </w:pPr>
+      <w:r>
+        <w:rPr>
+          <w:rFonts w:ascii="Times New Roman" w:hAnsi="Times New Roman" w:eastAsia="Times New Roman"/>
+          <w:b w:val="0"/>
+          <w:i/>
+          <w:color w:val="000000"/>
+          <w:sz w:val="20"/>
+        </w:rPr>
+        <w:t xml:space="preserve">Nota. </w:t>
+      </w:r>
+      <w:r>
+        <w:rPr>
+          <w:rFonts w:ascii="Times New Roman" w:hAnsi="Times New Roman" w:eastAsia="Times New Roman"/>
+          <w:b w:val="0"/>
+          <w:i w:val="0"/>
+          <w:color w:val="000000"/>
+          <w:sz w:val="20"/>
+        </w:rPr>
+        <w:t>Elaboración propia (2026). IBA medio 81,4 y prioridad VACA-087 permanecen legibles en pantallas pequeñas.</w:t>
       </w:r>
     </w:p>
     <w:p>
@@ -7186,7 +7704,7 @@
                 <w:color w:val="000000"/>
                 <w:sz w:val="20"/>
               </w:rPr>
-              <w:t>5 043</w:t>
+              <w:t>5 063</w:t>
             </w:r>
           </w:p>
         </w:tc>
@@ -7224,7 +7742,7 @@
                 <w:color w:val="000000"/>
                 <w:sz w:val="20"/>
               </w:rPr>
-              <w:t>8,13</w:t>
+              <w:t>8,21</w:t>
             </w:r>
           </w:p>
         </w:tc>
@@ -7262,7 +7780,7 @@
                 <w:color w:val="000000"/>
                 <w:sz w:val="20"/>
               </w:rPr>
-              <w:t>22</w:t>
+              <w:t>23</w:t>
             </w:r>
           </w:p>
         </w:tc>
@@ -7338,7 +7856,7 @@
                 <w:color w:val="000000"/>
                 <w:sz w:val="20"/>
               </w:rPr>
-              <w:t>95,8</w:t>
+              <w:t>95,6</w:t>
             </w:r>
           </w:p>
         </w:tc>
@@ -7472,7 +7990,7 @@
           <w:color w:val="000000"/>
           <w:sz w:val="24"/>
         </w:rPr>
-        <w:t>Se ejecutaron 66 casos automatizados y los 66 fueron satisfactorios en el build publicado. La densidad de defectos abiertos es baja y está documentada. El IBA medio observado en el tablero (81,4) es coherente con el inventario (cinco de seis evaluados) y con el animal fuera de umbral (VACA-087, 45,5, alerta de espacio mínimo ICA).</w:t>
+        <w:t>Se ejecutaron las siete suites automatizadas (unitarias TypeScript, unitarias/aceptación pytest, API, seguridad, rendimiento, calidad estática y E2E Playwright) con resultado 7/7. Los 14 escenarios EP del prototipo son satisfactorios en el build publicado, con captura de pantalla por caso. La densidad de defectos abiertos residuales es baja (bucket público y credenciales demo). El IBA medio observado en el tablero (81,4) es coherente con el inventario (cinco de seis evaluados) y con el animal fuera de umbral (VACA-087, 45,5, alerta de espacio mínimo ICA).</w:t>
       </w:r>
     </w:p>
     <w:p>
@@ -7673,7 +8191,7 @@
                 <w:color w:val="000000"/>
                 <w:sz w:val="20"/>
               </w:rPr>
-              <w:t>Corregido y verificado en producción (Playwright, 0,9 s)</w:t>
+              <w:t>Cerrado y verificado en producción (EP-14)</w:t>
             </w:r>
           </w:p>
         </w:tc>
@@ -7747,7 +8265,7 @@
                 <w:color w:val="000000"/>
                 <w:sz w:val="20"/>
               </w:rPr>
-              <w:t>Corregido: okText Aceptar y cancelText Cancelar</w:t>
+              <w:t>Cerrado: okText Aceptar y cancelText Cancelar</w:t>
             </w:r>
           </w:p>
         </w:tc>
@@ -7821,7 +8339,7 @@
                 <w:color w:val="000000"/>
                 <w:sz w:val="20"/>
               </w:rPr>
-              <w:t>Desplegado en producción. CSP no se impuso</w:t>
+              <w:t>Cerrado en producción. CSP no se impuso</w:t>
             </w:r>
           </w:p>
         </w:tc>
@@ -7895,7 +8413,7 @@
                 <w:color w:val="000000"/>
                 <w:sz w:val="20"/>
               </w:rPr>
-              <w:t>Riesgo aceptado de prototipo</w:t>
+              <w:t>Riesgo residual de prototipo</w:t>
             </w:r>
           </w:p>
         </w:tc>
@@ -7969,7 +8487,7 @@
                 <w:color w:val="000000"/>
                 <w:sz w:val="20"/>
               </w:rPr>
-              <w:t>Aceptable en prototipo; debe retirarse en un entorno productivo</w:t>
+              <w:t>Riesgo residual de prototipo</w:t>
             </w:r>
           </w:p>
         </w:tc>
@@ -8016,7 +8534,7 @@
           <w:color w:val="000000"/>
           <w:sz w:val="24"/>
         </w:rPr>
-        <w:t>El DEF-01 cortaba el caso de uso CU-11 en el build publicado. La causa raíz era una condición de carrera: signOut se disparaba sin await, navigateByUrl('/login') activaba guestGuard y restore() aún encontraba la sesión de Supabase. La corrección espera la invalidación del token, marca la sesión como limpiada para que restore() no la rehidrate y después navega. El 27 de octubre de 2026 se publicó en Vercel y Playwright confirmó el retorno a /#/login. Este hallazgo no debilita el trabajo: ilustra el valor de las pruebas empíricas sobre el despliegue, frente a una tabla de aceptación marcada a priori como satisfactoria (Sommerville, 2016).</w:t>
+        <w:t>El DEF-01 cortaba el caso de uso CU-11. La causa raíz era una condición de carrera: signOut se disparaba sin await, navigateByUrl('/login') activaba guestGuard y restore() aún encontraba la sesión de Supabase. La corrección espera la invalidación del token, marca la sesión como limpiada para que restore() no la rehidrate y después navega. Publicado en Vercel y reconfirmado por Playwright (retorno a /#/login). Este hallazgo ilustra el valor de las pruebas empíricas sobre el despliegue (Sommerville, 2016).</w:t>
       </w:r>
     </w:p>
     <w:p>
@@ -8189,7 +8707,7 @@
           <w:color w:val="000000"/>
           <w:sz w:val="24"/>
         </w:rPr>
-        <w:t>En el plano metodológico, la campaña confirma que una tabla de 14 escenarios marcada como satisfactoria sin automatizar el cierre de sesión en la nube es insuficiente (Pressman y Maxim, 2015). El DEF-01 solo apareció cuando Playwright esperó la URL /login después de Cerrar sesión; una vez desplegada la corrección, EP-14 pasó en producción. La lección para la Fábrica de Software es incorporar E2E del camino infeliz (logout, guarda, RLS anónimo) en la definición de terminado de cada sprint Scrum. Al mismo tiempo, la pirámide evitó que un error de THI (81,3 versus 82,92) llegara disfrazado de prueba verde.</w:t>
+        <w:t>En el plano metodológico, la campaña confirma que una tabla de 14 escenarios marcada como satisfactoria sin automatizar el cierre de sesión en la nube es insuficiente (Pressman y Maxim, 2015). El DEF-01 solo apareció cuando Playwright esperó la URL /login después de Cerrar sesión; con la corrección desplegada, EP-14 es satisfactorio en producción y la suite E2E completa está en verde. La lección para la Fábrica de Software es incorporar E2E del camino infeliz (logout, guarda, RLS anónimo) en la definición de terminado de cada sprint Scrum. Al mismo tiempo, la pirámide evitó que un error de THI (81,3 versus 82,92) llegara disfrazado de prueba verde.</w:t>
       </w:r>
     </w:p>
     <w:p>

</xml_diff>

<commit_message>
Refresh test campaign with settled screenshots and APA docs
Wait 8s before each Playwright capture against production, rerun the full suite (7/7), and regenerate the APA chapters and software-testing Word reports for 28 Oct 2026.

Co-authored-by: David Ramirez <davidrgj@users.noreply.github.com>
</commit_message>
<xml_diff>
--- a/docs/Capitulos_12_a_16_Pruebas_resultados_APA.docx
+++ b/docs/Capitulos_12_a_16_Pruebas_resultados_APA.docx
@@ -1175,7 +1175,7 @@
           <w:color w:val="000000"/>
           <w:sz w:val="24"/>
         </w:rPr>
-        <w:t>La campaña se ejecutó el 27 de octubre de 2026 (America/Bogota) contra el prototipo publicado en https://animal-welfare-platform-vepq.vercel.app/ y contra el código fuente versionado. El criterio de éxito no es la ausencia total de defectos —impropia de un prototipo académico—, sino la cobertura de los casos de uso CU-01 a CU-11, la corroboración de las fórmulas del índice de bienestar animal (IBA) y del índice temperatura-humedad (THI), y la documentación honesta de no conformidades, con su corrección cuando aplica (Myers et al., 2012).</w:t>
+        <w:t>La campaña se ejecutó el 28 de octubre de 2026 (America/Bogota) contra el prototipo publicado en https://animal-welfare-platform-vepq.vercel.app/ y contra el código fuente versionado. El criterio de éxito no es la ausencia total de defectos —impropia de un prototipo académico—, sino la cobertura de los casos de uso CU-01 a CU-11, la corroboración de las fórmulas del índice de bienestar animal (IBA) y del índice temperatura-humedad (THI), y la documentación honesta de no conformidades, con su corrección cuando aplica (Myers et al., 2012). Las capturas de pantalla del E2E se tomaron tras una espera de estabilización de ocho segundos por vista, para evitar fotogramas blancos o transitorios de Ionic.</w:t>
       </w:r>
     </w:p>
     <w:p>
@@ -2349,7 +2349,7 @@
                 <w:color w:val="000000"/>
                 <w:sz w:val="20"/>
               </w:rPr>
-              <w:t>27 de octubre de 2026, zona America/Bogota</w:t>
+              <w:t>28 de octubre de 2026, zona America/Bogota</w:t>
             </w:r>
           </w:p>
         </w:tc>
@@ -7436,7 +7436,7 @@
                 <w:color w:val="000000"/>
                 <w:sz w:val="20"/>
               </w:rPr>
-              <w:t>Cabeceras CSP, X-Frame-Options, nosniff, Referrer-Policy</w:t>
+              <w:t>Cabeceras X-Frame-Options, nosniff, Referrer-Policy, Permissions-Policy</w:t>
             </w:r>
           </w:p>
         </w:tc>
@@ -7454,7 +7454,7 @@
                 <w:color w:val="000000"/>
                 <w:sz w:val="20"/>
               </w:rPr>
-              <w:t>X-Frame-Options DENY, nosniff y Referrer-Policy están en producción; CSP no se forzó para no romper Angular</w:t>
+              <w:t>Satisfactorio. DENY, nosniff, Referrer-Policy y Permissions-Policy en vercel.json; CSP omitido porque script-src 'self' bloquea manejadores inline de Ionic</w:t>
             </w:r>
           </w:p>
         </w:tc>
@@ -7492,7 +7492,45 @@
                 <w:color w:val="000000"/>
                 <w:sz w:val="20"/>
               </w:rPr>
-              <w:t>Riesgo residual de diseño: welfare-photos es público en schema.sql</w:t>
+              <w:t>Satisfactorio. Bucket privado; el cliente usa URLs firmadas (createSignedUrl)</w:t>
+            </w:r>
+          </w:p>
+        </w:tc>
+      </w:tr>
+      <w:tr>
+        <w:tc>
+          <w:tcPr>
+            <w:tcW w:type="dxa" w:w="4561"/>
+          </w:tcPr>
+          <w:p>
+            <w:r/>
+            <w:r>
+              <w:rPr>
+                <w:rFonts w:ascii="Times New Roman" w:hAnsi="Times New Roman" w:eastAsia="Times New Roman"/>
+                <w:b w:val="0"/>
+                <w:i w:val="0"/>
+                <w:color w:val="000000"/>
+                <w:sz w:val="20"/>
+              </w:rPr>
+              <w:t>Credenciales demo en login</w:t>
+            </w:r>
+          </w:p>
+        </w:tc>
+        <w:tc>
+          <w:tcPr>
+            <w:tcW w:type="dxa" w:w="4561"/>
+          </w:tcPr>
+          <w:p>
+            <w:r/>
+            <w:r>
+              <w:rPr>
+                <w:rFonts w:ascii="Times New Roman" w:hAnsi="Times New Roman" w:eastAsia="Times New Roman"/>
+                <w:b w:val="0"/>
+                <w:i w:val="0"/>
+                <w:color w:val="000000"/>
+                <w:sz w:val="20"/>
+              </w:rPr>
+              <w:t>Satisfactorio. La UI no publica ni prellena contraseñas de demostración</w:t>
             </w:r>
           </w:p>
         </w:tc>
@@ -8321,7 +8359,7 @@
                 <w:color w:val="000000"/>
                 <w:sz w:val="20"/>
               </w:rPr>
-              <w:t>Faltaban X-Frame-Options, X-Content-Type-Options y Referrer-Policy.</w:t>
+              <w:t>Faltaban cabeceras de seguridad (frame, nosniff, referrer).</w:t>
             </w:r>
           </w:p>
         </w:tc>
@@ -8339,7 +8377,7 @@
                 <w:color w:val="000000"/>
                 <w:sz w:val="20"/>
               </w:rPr>
-              <w:t>Cerrado en producción. CSP no se impuso</w:t>
+              <w:t>Cerrado: vercel.json con DENY, nosniff, Referrer-Policy y Permissions-Policy; CSP retirado tras romper estilos de Ionic</w:t>
             </w:r>
           </w:p>
         </w:tc>
@@ -8395,7 +8433,7 @@
                 <w:color w:val="000000"/>
                 <w:sz w:val="20"/>
               </w:rPr>
-              <w:t>El bucket de fotos es público por esquema.</w:t>
+              <w:t>El bucket de fotos era público por esquema.</w:t>
             </w:r>
           </w:p>
         </w:tc>
@@ -8413,7 +8451,7 @@
                 <w:color w:val="000000"/>
                 <w:sz w:val="20"/>
               </w:rPr>
-              <w:t>Riesgo residual de prototipo</w:t>
+              <w:t>Cerrado: bucket privado + createSignedUrl; harden-storage.sql</w:t>
             </w:r>
           </w:p>
         </w:tc>
@@ -8469,7 +8507,7 @@
                 <w:color w:val="000000"/>
                 <w:sz w:val="20"/>
               </w:rPr>
-              <w:t>El login publica las credenciales de demostración.</w:t>
+              <w:t>El login publicaba las credenciales de demostración.</w:t>
             </w:r>
           </w:p>
         </w:tc>
@@ -8487,7 +8525,7 @@
                 <w:color w:val="000000"/>
                 <w:sz w:val="20"/>
               </w:rPr>
-              <w:t>Riesgo residual de prototipo</w:t>
+              <w:t>Cerrado: sin hint Demo ni campos prellenados</w:t>
             </w:r>
           </w:p>
         </w:tc>
@@ -8724,7 +8762,7 @@
           <w:color w:val="000000"/>
           <w:sz w:val="24"/>
         </w:rPr>
-        <w:t>Respecto a los RNF, HTTPS y HSTS se cumplen; el aislamiento del productor se verifica en unitarias y en RLS; la persistencia offline declarada en el análisis de requerimientos no se implementó ni se probó, y debe retirarse como compromiso del prototipo actual. Las cabeceras CSP incompletas son un riesgo residual típico de SPA Angular y se mitigaron parcialmente con X-Frame-Options y nosniff.</w:t>
+        <w:t>Respecto a los RNF, HTTPS y HSTS se cumplen; el aislamiento del productor se verifica en unitarias y en RLS; la persistencia offline declarada en el análisis de requerimientos no se implementó ni se probó, y debe retirarse como compromiso del prototipo actual. Una Content-Security-Policy estricta (script-src 'self') se evaluó y se retiró del despliegue porque bloqueaba manejadores inline de Ionic y dejaba la interfaz sin estilos; el riesgo residual de XSS se mitiga con X-Frame-Options DENY, nosniff, Referrer-Policy y Permissions-Policy.</w:t>
       </w:r>
     </w:p>
     <w:p>

</xml_diff>